<commit_message>
cambios en documento pdf y correo
</commit_message>
<xml_diff>
--- a/public/assets/documents/template-word/template_correspondencia_v2.docx
+++ b/public/assets/documents/template-word/template_correspondencia_v2.docx
@@ -847,9 +847,16 @@
                 <w:rFonts w:ascii="Noto Sans" w:eastAsia="Noto Sans" w:hAnsi="Noto Sans" w:cs="Noto Sans"/>
                 <w:lang w:val="en-US"/>
               </w:rPr>
-              <w:t>Área</w:t>
+              <w:t>Turnado</w:t>
             </w:r>
             <w:proofErr w:type="spellEnd"/>
+            <w:r>
+              <w:rPr>
+                <w:rFonts w:ascii="Noto Sans" w:eastAsia="Noto Sans" w:hAnsi="Noto Sans" w:cs="Noto Sans"/>
+                <w:lang w:val="en-US"/>
+              </w:rPr>
+              <w:t xml:space="preserve"> a</w:t>
+            </w:r>
           </w:p>
         </w:tc>
         <w:tc>

</xml_diff>

<commit_message>
Se agrega copia a en reporte
</commit_message>
<xml_diff>
--- a/public/assets/documents/template-word/template_correspondencia_v2.docx
+++ b/public/assets/documents/template-word/template_correspondencia_v2.docx
@@ -1,6 +1,6 @@
 
 <file path=word/document.xml><?xml version="1.0" encoding="utf-8"?>
-<w:document xmlns:wpc="http://schemas.microsoft.com/office/word/2010/wordprocessingCanvas" xmlns:cx="http://schemas.microsoft.com/office/drawing/2014/chartex" xmlns:cx1="http://schemas.microsoft.com/office/drawing/2015/9/8/chartex" xmlns:cx2="http://schemas.microsoft.com/office/drawing/2015/10/21/chartex" xmlns:cx3="http://schemas.microsoft.com/office/drawing/2016/5/9/chartex" xmlns:cx4="http://schemas.microsoft.com/office/drawing/2016/5/10/chartex" xmlns:cx5="http://schemas.microsoft.com/office/drawing/2016/5/11/chartex" xmlns:cx6="http://schemas.microsoft.com/office/drawing/2016/5/12/chartex" xmlns:cx7="http://schemas.microsoft.com/office/drawing/2016/5/13/chartex" xmlns:cx8="http://schemas.microsoft.com/office/drawing/2016/5/14/chartex" xmlns:mc="http://schemas.openxmlformats.org/markup-compatibility/2006" xmlns:aink="http://schemas.microsoft.com/office/drawing/2016/ink" xmlns:am3d="http://schemas.microsoft.com/office/drawing/2017/model3d" xmlns:o="urn:schemas-microsoft-com:office:office" xmlns:oel="http://schemas.microsoft.com/office/2019/extlst" xmlns:r="http://schemas.openxmlformats.org/officeDocument/2006/relationships" xmlns:m="http://schemas.openxmlformats.org/officeDocument/2006/math" xmlns:v="urn:schemas-microsoft-com:vml" xmlns:wp14="http://schemas.microsoft.com/office/word/2010/wordprocessingDrawing" xmlns:wp="http://schemas.openxmlformats.org/drawingml/2006/wordprocessingDrawing" xmlns:w10="urn:schemas-microsoft-com:office:word" xmlns:w="http://schemas.openxmlformats.org/wordprocessingml/2006/main" xmlns:w14="http://schemas.microsoft.com/office/word/2010/wordml" xmlns:w15="http://schemas.microsoft.com/office/word/2012/wordml" xmlns:w16cex="http://schemas.microsoft.com/office/word/2018/wordml/cex" xmlns:w16cid="http://schemas.microsoft.com/office/word/2016/wordml/cid" xmlns:w16="http://schemas.microsoft.com/office/word/2018/wordml" xmlns:w16du="http://schemas.microsoft.com/office/word/2023/wordml/word16du" xmlns:w16sdtdh="http://schemas.microsoft.com/office/word/2020/wordml/sdtdatahash" xmlns:w16sdtfl="http://schemas.microsoft.com/office/word/2024/wordml/sdtformatlock" xmlns:w16se="http://schemas.microsoft.com/office/word/2015/wordml/symex" xmlns:wpg="http://schemas.microsoft.com/office/word/2010/wordprocessingGroup" xmlns:wpi="http://schemas.microsoft.com/office/word/2010/wordprocessingInk" xmlns:wne="http://schemas.microsoft.com/office/word/2006/wordml" xmlns:wps="http://schemas.microsoft.com/office/word/2010/wordprocessingShape" mc:Ignorable="w14 w15 w16se w16cid w16 w16cex w16sdtdh w16sdtfl w16du wp14">
+<w:document xmlns:wpc="http://schemas.microsoft.com/office/word/2010/wordprocessingCanvas" xmlns:cx="http://schemas.microsoft.com/office/drawing/2014/chartex" xmlns:cx1="http://schemas.microsoft.com/office/drawing/2015/9/8/chartex" xmlns:mc="http://schemas.openxmlformats.org/markup-compatibility/2006" xmlns:o="urn:schemas-microsoft-com:office:office" xmlns:r="http://schemas.openxmlformats.org/officeDocument/2006/relationships" xmlns:m="http://schemas.openxmlformats.org/officeDocument/2006/math" xmlns:v="urn:schemas-microsoft-com:vml" xmlns:wp14="http://schemas.microsoft.com/office/word/2010/wordprocessingDrawing" xmlns:wp="http://schemas.openxmlformats.org/drawingml/2006/wordprocessingDrawing" xmlns:w10="urn:schemas-microsoft-com:office:word" xmlns:w="http://schemas.openxmlformats.org/wordprocessingml/2006/main" xmlns:w14="http://schemas.microsoft.com/office/word/2010/wordml" xmlns:w15="http://schemas.microsoft.com/office/word/2012/wordml" xmlns:w16se="http://schemas.microsoft.com/office/word/2015/wordml/symex" xmlns:wpg="http://schemas.microsoft.com/office/word/2010/wordprocessingGroup" xmlns:wpi="http://schemas.microsoft.com/office/word/2010/wordprocessingInk" xmlns:wne="http://schemas.microsoft.com/office/word/2006/wordml" xmlns:wps="http://schemas.microsoft.com/office/word/2010/wordprocessingShape" mc:Ignorable="w14 w15 w16se wp14">
   <w:body>
     <w:p>
       <w:pPr>
@@ -18,7 +18,7 @@
         <w:rPr>
           <w:rFonts w:ascii="Noto Sans" w:eastAsia="Noto Sans" w:hAnsi="Noto Sans" w:cs="Noto Sans"/>
           <w:noProof/>
-          <w:lang w:val="en-US"/>
+          <w:lang w:eastAsia="es-MX"/>
         </w:rPr>
         <mc:AlternateContent>
           <mc:Choice Requires="wps">
@@ -88,7 +88,7 @@
               </wp:anchor>
             </w:drawing>
           </mc:Choice>
-          <mc:Fallback>
+          <mc:Fallback xmlns:w16sdtfl="http://schemas.microsoft.com/office/word/2024/wordml/sdtformatlock" xmlns:w16sdtdh="http://schemas.microsoft.com/office/word/2020/wordml/sdtdatahash" xmlns:w16du="http://schemas.microsoft.com/office/word/2023/wordml/word16du" xmlns:w16="http://schemas.microsoft.com/office/word/2018/wordml" xmlns:w16cid="http://schemas.microsoft.com/office/word/2016/wordml/cid" xmlns:w16cex="http://schemas.microsoft.com/office/word/2018/wordml/cex" xmlns:oel="http://schemas.microsoft.com/office/2019/extlst" xmlns:am3d="http://schemas.microsoft.com/office/drawing/2017/model3d" xmlns:aink="http://schemas.microsoft.com/office/drawing/2016/ink" xmlns:cx8="http://schemas.microsoft.com/office/drawing/2016/5/14/chartex" xmlns:cx7="http://schemas.microsoft.com/office/drawing/2016/5/13/chartex" xmlns:cx6="http://schemas.microsoft.com/office/drawing/2016/5/12/chartex" xmlns:cx5="http://schemas.microsoft.com/office/drawing/2016/5/11/chartex" xmlns:cx4="http://schemas.microsoft.com/office/drawing/2016/5/10/chartex" xmlns:cx3="http://schemas.microsoft.com/office/drawing/2016/5/9/chartex" xmlns:cx2="http://schemas.microsoft.com/office/drawing/2015/10/21/chartex">
             <w:pict>
               <v:shapetype w14:anchorId="3D939B4E" id="_x0000_t202" coordsize="21600,21600" o:spt="202" path="m,l,21600r21600,l21600,xe">
                 <v:stroke joinstyle="miter"/>
@@ -1227,6 +1227,121 @@
           </w:p>
         </w:tc>
       </w:tr>
+      <w:tr>
+        <w:trPr>
+          <w:trHeight w:val="419"/>
+        </w:trPr>
+        <w:tc>
+          <w:tcPr>
+            <w:tcW w:w="2268" w:type="dxa"/>
+            <w:shd w:val="clear" w:color="auto" w:fill="D9D9D9" w:themeFill="background1" w:themeFillShade="D9"/>
+            <w:vAlign w:val="center"/>
+          </w:tcPr>
+          <w:p>
+            <w:pPr>
+              <w:rPr>
+                <w:rFonts w:ascii="Noto Sans" w:eastAsia="Noto Sans" w:hAnsi="Noto Sans" w:cs="Noto Sans"/>
+                <w:lang w:val="en-US"/>
+              </w:rPr>
+            </w:pPr>
+            <w:proofErr w:type="spellStart"/>
+            <w:r>
+              <w:rPr>
+                <w:rFonts w:ascii="Noto Sans" w:eastAsia="Noto Sans" w:hAnsi="Noto Sans" w:cs="Noto Sans"/>
+                <w:lang w:val="en-US"/>
+              </w:rPr>
+              <w:t>Usuario</w:t>
+            </w:r>
+            <w:proofErr w:type="spellEnd"/>
+          </w:p>
+        </w:tc>
+        <w:tc>
+          <w:tcPr>
+            <w:tcW w:w="8359" w:type="dxa"/>
+            <w:shd w:val="clear" w:color="auto" w:fill="D9D9D9" w:themeFill="background1" w:themeFillShade="D9"/>
+            <w:vAlign w:val="center"/>
+          </w:tcPr>
+          <w:p>
+            <w:pPr>
+              <w:rPr>
+                <w:lang w:val="en-US"/>
+              </w:rPr>
+            </w:pPr>
+          </w:p>
+        </w:tc>
+      </w:tr>
+      <w:tr>
+        <w:trPr>
+          <w:trHeight w:val="419"/>
+        </w:trPr>
+        <w:tc>
+          <w:tcPr>
+            <w:tcW w:w="2268" w:type="dxa"/>
+            <w:shd w:val="clear" w:color="auto" w:fill="FFFFFF" w:themeFill="background1"/>
+            <w:vAlign w:val="center"/>
+          </w:tcPr>
+          <w:p>
+            <w:pPr>
+              <w:rPr>
+                <w:rFonts w:ascii="Noto Sans" w:eastAsia="Noto Sans" w:hAnsi="Noto Sans" w:cs="Noto Sans"/>
+                <w:lang w:val="en-US"/>
+              </w:rPr>
+            </w:pPr>
+          </w:p>
+          <w:p>
+            <w:pPr>
+              <w:rPr>
+                <w:rFonts w:ascii="Noto Sans" w:eastAsia="Noto Sans" w:hAnsi="Noto Sans" w:cs="Noto Sans"/>
+                <w:lang w:val="en-US"/>
+              </w:rPr>
+            </w:pPr>
+            <w:proofErr w:type="spellStart"/>
+            <w:r>
+              <w:rPr>
+                <w:rFonts w:ascii="Noto Sans" w:eastAsia="Noto Sans" w:hAnsi="Noto Sans" w:cs="Noto Sans"/>
+                <w:lang w:val="en-US"/>
+              </w:rPr>
+              <w:t>Copia</w:t>
+            </w:r>
+            <w:proofErr w:type="spellEnd"/>
+            <w:r>
+              <w:rPr>
+                <w:rFonts w:ascii="Noto Sans" w:eastAsia="Noto Sans" w:hAnsi="Noto Sans" w:cs="Noto Sans"/>
+                <w:lang w:val="en-US"/>
+              </w:rPr>
+              <w:t xml:space="preserve"> a</w:t>
+            </w:r>
+          </w:p>
+        </w:tc>
+        <w:tc>
+          <w:tcPr>
+            <w:tcW w:w="8359" w:type="dxa"/>
+            <w:shd w:val="clear" w:color="auto" w:fill="FFFFFF" w:themeFill="background1"/>
+            <w:vAlign w:val="center"/>
+          </w:tcPr>
+          <w:p>
+            <w:pPr>
+              <w:rPr>
+                <w:lang w:val="en-US"/>
+              </w:rPr>
+            </w:pPr>
+          </w:p>
+          <w:p>
+            <w:pPr>
+              <w:rPr>
+                <w:lang w:val="en-US"/>
+              </w:rPr>
+            </w:pPr>
+          </w:p>
+          <w:p>
+            <w:pPr>
+              <w:rPr>
+                <w:lang w:val="en-US"/>
+              </w:rPr>
+            </w:pPr>
+          </w:p>
+        </w:tc>
+      </w:tr>
     </w:tbl>
     <w:p>
       <w:pPr>
@@ -1246,14 +1361,8 @@
         </w:rPr>
       </w:pPr>
     </w:p>
-    <w:p>
-      <w:pPr>
-        <w:rPr>
-          <w:u w:val="single"/>
-          <w:lang w:val="en-US"/>
-        </w:rPr>
-      </w:pPr>
-    </w:p>
+    <w:bookmarkStart w:id="0" w:name="_GoBack"/>
+    <w:bookmarkEnd w:id="0"/>
     <w:p>
       <w:pPr>
         <w:rPr>
@@ -1268,6 +1377,7 @@
           <w:noProof/>
           <w:sz w:val="16"/>
           <w:szCs w:val="16"/>
+          <w:lang w:eastAsia="es-MX"/>
         </w:rPr>
         <mc:AlternateContent>
           <mc:Choice Requires="wps">
@@ -1331,7 +1441,6 @@
                                 <w:lang w:val="en-US"/>
                               </w:rPr>
                             </w:pPr>
-                            <w:proofErr w:type="spellStart"/>
                             <w:r>
                               <w:rPr>
                                 <w:rFonts w:ascii="Noto Sans" w:eastAsia="Noto Sans" w:hAnsi="Noto Sans" w:cs="Noto Sans"/>
@@ -1339,17 +1448,7 @@
                                 <w:szCs w:val="20"/>
                                 <w:lang w:val="en-US"/>
                               </w:rPr>
-                              <w:t>Lic</w:t>
-                            </w:r>
-                            <w:proofErr w:type="spellEnd"/>
-                            <w:r>
-                              <w:rPr>
-                                <w:rFonts w:ascii="Noto Sans" w:eastAsia="Noto Sans" w:hAnsi="Noto Sans" w:cs="Noto Sans"/>
-                                <w:sz w:val="20"/>
-                                <w:szCs w:val="20"/>
-                                <w:lang w:val="en-US"/>
-                              </w:rPr>
-                              <w:t>. Berenice Morales Ruiz</w:t>
+                              <w:t>Lic. Berenice Morales Ruiz</w:t>
                             </w:r>
                           </w:p>
                           <w:p>
@@ -1424,7 +1523,7 @@
               </wp:anchor>
             </w:drawing>
           </mc:Choice>
-          <mc:Fallback>
+          <mc:Fallback xmlns:w16sdtfl="http://schemas.microsoft.com/office/word/2024/wordml/sdtformatlock" xmlns:w16sdtdh="http://schemas.microsoft.com/office/word/2020/wordml/sdtdatahash" xmlns:w16du="http://schemas.microsoft.com/office/word/2023/wordml/word16du" xmlns:w16="http://schemas.microsoft.com/office/word/2018/wordml" xmlns:w16cid="http://schemas.microsoft.com/office/word/2016/wordml/cid" xmlns:w16cex="http://schemas.microsoft.com/office/word/2018/wordml/cex" xmlns:oel="http://schemas.microsoft.com/office/2019/extlst" xmlns:am3d="http://schemas.microsoft.com/office/drawing/2017/model3d" xmlns:aink="http://schemas.microsoft.com/office/drawing/2016/ink" xmlns:cx8="http://schemas.microsoft.com/office/drawing/2016/5/14/chartex" xmlns:cx7="http://schemas.microsoft.com/office/drawing/2016/5/13/chartex" xmlns:cx6="http://schemas.microsoft.com/office/drawing/2016/5/12/chartex" xmlns:cx5="http://schemas.microsoft.com/office/drawing/2016/5/11/chartex" xmlns:cx4="http://schemas.microsoft.com/office/drawing/2016/5/10/chartex" xmlns:cx3="http://schemas.microsoft.com/office/drawing/2016/5/9/chartex" xmlns:cx2="http://schemas.microsoft.com/office/drawing/2015/10/21/chartex">
             <w:pict>
               <v:shape w14:anchorId="40B24BEB" id="_x0000_s1027" type="#_x0000_t202" style="position:absolute;margin-left:0;margin-top:43.95pt;width:366.75pt;height:38.25pt;z-index:251659264;visibility:visible;mso-wrap-style:square;mso-width-percent:0;mso-height-percent:0;mso-wrap-distance-left:9pt;mso-wrap-distance-top:3.6pt;mso-wrap-distance-right:9pt;mso-wrap-distance-bottom:3.6pt;mso-position-horizontal:center;mso-position-horizontal-relative:margin;mso-position-vertical:absolute;mso-position-vertical-relative:text;mso-width-percent:0;mso-height-percent:0;mso-width-relative:margin;mso-height-relative:margin;v-text-anchor:top" o:gfxdata="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" filled="f" stroked="f">
                 <v:textbox>
@@ -1532,6 +1631,7 @@
           <w:noProof/>
           <w:sz w:val="16"/>
           <w:szCs w:val="16"/>
+          <w:lang w:eastAsia="es-MX"/>
         </w:rPr>
         <mc:AlternateContent>
           <mc:Choice Requires="wps">
@@ -1590,7 +1690,7 @@
               </wp:anchor>
             </w:drawing>
           </mc:Choice>
-          <mc:Fallback>
+          <mc:Fallback xmlns:w16sdtfl="http://schemas.microsoft.com/office/word/2024/wordml/sdtformatlock" xmlns:w16sdtdh="http://schemas.microsoft.com/office/word/2020/wordml/sdtdatahash" xmlns:w16du="http://schemas.microsoft.com/office/word/2023/wordml/word16du" xmlns:w16="http://schemas.microsoft.com/office/word/2018/wordml" xmlns:w16cid="http://schemas.microsoft.com/office/word/2016/wordml/cid" xmlns:w16cex="http://schemas.microsoft.com/office/word/2018/wordml/cex" xmlns:oel="http://schemas.microsoft.com/office/2019/extlst" xmlns:am3d="http://schemas.microsoft.com/office/drawing/2017/model3d" xmlns:aink="http://schemas.microsoft.com/office/drawing/2016/ink" xmlns:cx8="http://schemas.microsoft.com/office/drawing/2016/5/14/chartex" xmlns:cx7="http://schemas.microsoft.com/office/drawing/2016/5/13/chartex" xmlns:cx6="http://schemas.microsoft.com/office/drawing/2016/5/12/chartex" xmlns:cx5="http://schemas.microsoft.com/office/drawing/2016/5/11/chartex" xmlns:cx4="http://schemas.microsoft.com/office/drawing/2016/5/10/chartex" xmlns:cx3="http://schemas.microsoft.com/office/drawing/2016/5/9/chartex" xmlns:cx2="http://schemas.microsoft.com/office/drawing/2015/10/21/chartex">
             <w:pict>
               <v:line w14:anchorId="2FA7F456" id="Conector recto 10" o:spid="_x0000_s1026" style="position:absolute;flip:y;z-index:251660288;visibility:visible;mso-wrap-style:square;mso-width-percent:0;mso-height-percent:0;mso-wrap-distance-left:9pt;mso-wrap-distance-top:0;mso-wrap-distance-right:9pt;mso-wrap-distance-bottom:0;mso-position-horizontal:absolute;mso-position-horizontal-relative:text;mso-position-vertical:absolute;mso-position-vertical-relative:text;mso-width-percent:0;mso-height-percent:0;mso-width-relative:margin;mso-height-relative:margin" from="89.65pt,40.8pt" to="347.65pt,41.3pt" o:gfxdata="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" strokecolor="black [3200]" strokeweight="1pt">
                 <v:stroke joinstyle="miter"/>
@@ -1622,7 +1722,7 @@
 </file>
 
 <file path=word/endnotes.xml><?xml version="1.0" encoding="utf-8"?>
-<w:endnotes xmlns:wpc="http://schemas.microsoft.com/office/word/2010/wordprocessingCanvas" xmlns:cx="http://schemas.microsoft.com/office/drawing/2014/chartex" xmlns:cx1="http://schemas.microsoft.com/office/drawing/2015/9/8/chartex" xmlns:cx2="http://schemas.microsoft.com/office/drawing/2015/10/21/chartex" xmlns:cx3="http://schemas.microsoft.com/office/drawing/2016/5/9/chartex" xmlns:cx4="http://schemas.microsoft.com/office/drawing/2016/5/10/chartex" xmlns:cx5="http://schemas.microsoft.com/office/drawing/2016/5/11/chartex" xmlns:cx6="http://schemas.microsoft.com/office/drawing/2016/5/12/chartex" xmlns:cx7="http://schemas.microsoft.com/office/drawing/2016/5/13/chartex" xmlns:cx8="http://schemas.microsoft.com/office/drawing/2016/5/14/chartex" xmlns:mc="http://schemas.openxmlformats.org/markup-compatibility/2006" xmlns:aink="http://schemas.microsoft.com/office/drawing/2016/ink" xmlns:am3d="http://schemas.microsoft.com/office/drawing/2017/model3d" xmlns:o="urn:schemas-microsoft-com:office:office" xmlns:oel="http://schemas.microsoft.com/office/2019/extlst" xmlns:r="http://schemas.openxmlformats.org/officeDocument/2006/relationships" xmlns:m="http://schemas.openxmlformats.org/officeDocument/2006/math" xmlns:v="urn:schemas-microsoft-com:vml" xmlns:wp14="http://schemas.microsoft.com/office/word/2010/wordprocessingDrawing" xmlns:wp="http://schemas.openxmlformats.org/drawingml/2006/wordprocessingDrawing" xmlns:w10="urn:schemas-microsoft-com:office:word" xmlns:w="http://schemas.openxmlformats.org/wordprocessingml/2006/main" xmlns:w14="http://schemas.microsoft.com/office/word/2010/wordml" xmlns:w15="http://schemas.microsoft.com/office/word/2012/wordml" xmlns:w16cex="http://schemas.microsoft.com/office/word/2018/wordml/cex" xmlns:w16cid="http://schemas.microsoft.com/office/word/2016/wordml/cid" xmlns:w16="http://schemas.microsoft.com/office/word/2018/wordml" xmlns:w16du="http://schemas.microsoft.com/office/word/2023/wordml/word16du" xmlns:w16sdtdh="http://schemas.microsoft.com/office/word/2020/wordml/sdtdatahash" xmlns:w16sdtfl="http://schemas.microsoft.com/office/word/2024/wordml/sdtformatlock" xmlns:w16se="http://schemas.microsoft.com/office/word/2015/wordml/symex" xmlns:wpg="http://schemas.microsoft.com/office/word/2010/wordprocessingGroup" xmlns:wpi="http://schemas.microsoft.com/office/word/2010/wordprocessingInk" xmlns:wne="http://schemas.microsoft.com/office/word/2006/wordml" xmlns:wps="http://schemas.microsoft.com/office/word/2010/wordprocessingShape" mc:Ignorable="w14 w15 w16se w16cid w16 w16cex w16sdtdh w16sdtfl w16du wp14">
+<w:endnotes xmlns:wpc="http://schemas.microsoft.com/office/word/2010/wordprocessingCanvas" xmlns:cx="http://schemas.microsoft.com/office/drawing/2014/chartex" xmlns:cx1="http://schemas.microsoft.com/office/drawing/2015/9/8/chartex" xmlns:mc="http://schemas.openxmlformats.org/markup-compatibility/2006" xmlns:o="urn:schemas-microsoft-com:office:office" xmlns:r="http://schemas.openxmlformats.org/officeDocument/2006/relationships" xmlns:m="http://schemas.openxmlformats.org/officeDocument/2006/math" xmlns:v="urn:schemas-microsoft-com:vml" xmlns:wp14="http://schemas.microsoft.com/office/word/2010/wordprocessingDrawing" xmlns:wp="http://schemas.openxmlformats.org/drawingml/2006/wordprocessingDrawing" xmlns:w10="urn:schemas-microsoft-com:office:word" xmlns:w="http://schemas.openxmlformats.org/wordprocessingml/2006/main" xmlns:w14="http://schemas.microsoft.com/office/word/2010/wordml" xmlns:w15="http://schemas.microsoft.com/office/word/2012/wordml" xmlns:w16se="http://schemas.microsoft.com/office/word/2015/wordml/symex" xmlns:wpg="http://schemas.microsoft.com/office/word/2010/wordprocessingGroup" xmlns:wpi="http://schemas.microsoft.com/office/word/2010/wordprocessingInk" xmlns:wne="http://schemas.microsoft.com/office/word/2006/wordml" xmlns:wps="http://schemas.microsoft.com/office/word/2010/wordprocessingShape" mc:Ignorable="w14 w15 w16se wp14">
   <w:endnote w:type="separator" w:id="-1">
     <w:p>
       <w:pPr>
@@ -1647,7 +1747,7 @@
 </file>
 
 <file path=word/footer1.xml><?xml version="1.0" encoding="utf-8"?>
-<w:ftr xmlns:wpc="http://schemas.microsoft.com/office/word/2010/wordprocessingCanvas" xmlns:cx="http://schemas.microsoft.com/office/drawing/2014/chartex" xmlns:cx1="http://schemas.microsoft.com/office/drawing/2015/9/8/chartex" xmlns:cx2="http://schemas.microsoft.com/office/drawing/2015/10/21/chartex" xmlns:cx3="http://schemas.microsoft.com/office/drawing/2016/5/9/chartex" xmlns:cx4="http://schemas.microsoft.com/office/drawing/2016/5/10/chartex" xmlns:cx5="http://schemas.microsoft.com/office/drawing/2016/5/11/chartex" xmlns:cx6="http://schemas.microsoft.com/office/drawing/2016/5/12/chartex" xmlns:cx7="http://schemas.microsoft.com/office/drawing/2016/5/13/chartex" xmlns:cx8="http://schemas.microsoft.com/office/drawing/2016/5/14/chartex" xmlns:mc="http://schemas.openxmlformats.org/markup-compatibility/2006" xmlns:aink="http://schemas.microsoft.com/office/drawing/2016/ink" xmlns:am3d="http://schemas.microsoft.com/office/drawing/2017/model3d" xmlns:o="urn:schemas-microsoft-com:office:office" xmlns:oel="http://schemas.microsoft.com/office/2019/extlst" xmlns:r="http://schemas.openxmlformats.org/officeDocument/2006/relationships" xmlns:m="http://schemas.openxmlformats.org/officeDocument/2006/math" xmlns:v="urn:schemas-microsoft-com:vml" xmlns:wp14="http://schemas.microsoft.com/office/word/2010/wordprocessingDrawing" xmlns:wp="http://schemas.openxmlformats.org/drawingml/2006/wordprocessingDrawing" xmlns:w10="urn:schemas-microsoft-com:office:word" xmlns:w="http://schemas.openxmlformats.org/wordprocessingml/2006/main" xmlns:w14="http://schemas.microsoft.com/office/word/2010/wordml" xmlns:w15="http://schemas.microsoft.com/office/word/2012/wordml" xmlns:w16cex="http://schemas.microsoft.com/office/word/2018/wordml/cex" xmlns:w16cid="http://schemas.microsoft.com/office/word/2016/wordml/cid" xmlns:w16="http://schemas.microsoft.com/office/word/2018/wordml" xmlns:w16du="http://schemas.microsoft.com/office/word/2023/wordml/word16du" xmlns:w16sdtdh="http://schemas.microsoft.com/office/word/2020/wordml/sdtdatahash" xmlns:w16sdtfl="http://schemas.microsoft.com/office/word/2024/wordml/sdtformatlock" xmlns:w16se="http://schemas.microsoft.com/office/word/2015/wordml/symex" xmlns:wpg="http://schemas.microsoft.com/office/word/2010/wordprocessingGroup" xmlns:wpi="http://schemas.microsoft.com/office/word/2010/wordprocessingInk" xmlns:wne="http://schemas.microsoft.com/office/word/2006/wordml" xmlns:wps="http://schemas.microsoft.com/office/word/2010/wordprocessingShape" mc:Ignorable="w14 w15 w16se w16cid w16 w16cex w16sdtdh w16sdtfl w16du wp14">
+<w:ftr xmlns:wpc="http://schemas.microsoft.com/office/word/2010/wordprocessingCanvas" xmlns:cx="http://schemas.microsoft.com/office/drawing/2014/chartex" xmlns:cx1="http://schemas.microsoft.com/office/drawing/2015/9/8/chartex" xmlns:mc="http://schemas.openxmlformats.org/markup-compatibility/2006" xmlns:o="urn:schemas-microsoft-com:office:office" xmlns:r="http://schemas.openxmlformats.org/officeDocument/2006/relationships" xmlns:m="http://schemas.openxmlformats.org/officeDocument/2006/math" xmlns:v="urn:schemas-microsoft-com:vml" xmlns:wp14="http://schemas.microsoft.com/office/word/2010/wordprocessingDrawing" xmlns:wp="http://schemas.openxmlformats.org/drawingml/2006/wordprocessingDrawing" xmlns:w10="urn:schemas-microsoft-com:office:word" xmlns:w="http://schemas.openxmlformats.org/wordprocessingml/2006/main" xmlns:w14="http://schemas.microsoft.com/office/word/2010/wordml" xmlns:w15="http://schemas.microsoft.com/office/word/2012/wordml" xmlns:w16se="http://schemas.microsoft.com/office/word/2015/wordml/symex" xmlns:wpg="http://schemas.microsoft.com/office/word/2010/wordprocessingGroup" xmlns:wpi="http://schemas.microsoft.com/office/word/2010/wordprocessingInk" xmlns:wne="http://schemas.microsoft.com/office/word/2006/wordml" xmlns:wps="http://schemas.microsoft.com/office/word/2010/wordprocessingShape" mc:Ignorable="w14 w15 w16se wp14">
   <w:p>
     <w:pPr>
       <w:pStyle w:val="Piedepgina"/>
@@ -1657,7 +1757,7 @@
 </file>
 
 <file path=word/footer2.xml><?xml version="1.0" encoding="utf-8"?>
-<w:ftr xmlns:wpc="http://schemas.microsoft.com/office/word/2010/wordprocessingCanvas" xmlns:cx="http://schemas.microsoft.com/office/drawing/2014/chartex" xmlns:cx1="http://schemas.microsoft.com/office/drawing/2015/9/8/chartex" xmlns:cx2="http://schemas.microsoft.com/office/drawing/2015/10/21/chartex" xmlns:cx3="http://schemas.microsoft.com/office/drawing/2016/5/9/chartex" xmlns:cx4="http://schemas.microsoft.com/office/drawing/2016/5/10/chartex" xmlns:cx5="http://schemas.microsoft.com/office/drawing/2016/5/11/chartex" xmlns:cx6="http://schemas.microsoft.com/office/drawing/2016/5/12/chartex" xmlns:cx7="http://schemas.microsoft.com/office/drawing/2016/5/13/chartex" xmlns:cx8="http://schemas.microsoft.com/office/drawing/2016/5/14/chartex" xmlns:mc="http://schemas.openxmlformats.org/markup-compatibility/2006" xmlns:aink="http://schemas.microsoft.com/office/drawing/2016/ink" xmlns:am3d="http://schemas.microsoft.com/office/drawing/2017/model3d" xmlns:o="urn:schemas-microsoft-com:office:office" xmlns:oel="http://schemas.microsoft.com/office/2019/extlst" xmlns:r="http://schemas.openxmlformats.org/officeDocument/2006/relationships" xmlns:m="http://schemas.openxmlformats.org/officeDocument/2006/math" xmlns:v="urn:schemas-microsoft-com:vml" xmlns:wp14="http://schemas.microsoft.com/office/word/2010/wordprocessingDrawing" xmlns:wp="http://schemas.openxmlformats.org/drawingml/2006/wordprocessingDrawing" xmlns:w10="urn:schemas-microsoft-com:office:word" xmlns:w="http://schemas.openxmlformats.org/wordprocessingml/2006/main" xmlns:w14="http://schemas.microsoft.com/office/word/2010/wordml" xmlns:w15="http://schemas.microsoft.com/office/word/2012/wordml" xmlns:w16cex="http://schemas.microsoft.com/office/word/2018/wordml/cex" xmlns:w16cid="http://schemas.microsoft.com/office/word/2016/wordml/cid" xmlns:w16="http://schemas.microsoft.com/office/word/2018/wordml" xmlns:w16du="http://schemas.microsoft.com/office/word/2023/wordml/word16du" xmlns:w16sdtdh="http://schemas.microsoft.com/office/word/2020/wordml/sdtdatahash" xmlns:w16sdtfl="http://schemas.microsoft.com/office/word/2024/wordml/sdtformatlock" xmlns:w16se="http://schemas.microsoft.com/office/word/2015/wordml/symex" xmlns:wpg="http://schemas.microsoft.com/office/word/2010/wordprocessingGroup" xmlns:wpi="http://schemas.microsoft.com/office/word/2010/wordprocessingInk" xmlns:wne="http://schemas.microsoft.com/office/word/2006/wordml" xmlns:wps="http://schemas.microsoft.com/office/word/2010/wordprocessingShape" mc:Ignorable="w14 w15 w16se w16cid w16 w16cex w16sdtdh w16sdtfl w16du wp14">
+<w:ftr xmlns:wpc="http://schemas.microsoft.com/office/word/2010/wordprocessingCanvas" xmlns:cx="http://schemas.microsoft.com/office/drawing/2014/chartex" xmlns:cx1="http://schemas.microsoft.com/office/drawing/2015/9/8/chartex" xmlns:mc="http://schemas.openxmlformats.org/markup-compatibility/2006" xmlns:o="urn:schemas-microsoft-com:office:office" xmlns:r="http://schemas.openxmlformats.org/officeDocument/2006/relationships" xmlns:m="http://schemas.openxmlformats.org/officeDocument/2006/math" xmlns:v="urn:schemas-microsoft-com:vml" xmlns:wp14="http://schemas.microsoft.com/office/word/2010/wordprocessingDrawing" xmlns:wp="http://schemas.openxmlformats.org/drawingml/2006/wordprocessingDrawing" xmlns:w10="urn:schemas-microsoft-com:office:word" xmlns:w="http://schemas.openxmlformats.org/wordprocessingml/2006/main" xmlns:w14="http://schemas.microsoft.com/office/word/2010/wordml" xmlns:w15="http://schemas.microsoft.com/office/word/2012/wordml" xmlns:w16se="http://schemas.microsoft.com/office/word/2015/wordml/symex" xmlns:wpg="http://schemas.microsoft.com/office/word/2010/wordprocessingGroup" xmlns:wpi="http://schemas.microsoft.com/office/word/2010/wordprocessingInk" xmlns:wne="http://schemas.microsoft.com/office/word/2006/wordml" xmlns:wps="http://schemas.microsoft.com/office/word/2010/wordprocessingShape" mc:Ignorable="w14 w15 w16se wp14">
   <w:p>
     <w:pPr>
       <w:pStyle w:val="Piedepgina"/>
@@ -1665,6 +1765,7 @@
     <w:r>
       <w:rPr>
         <w:noProof/>
+        <w:lang w:eastAsia="es-MX"/>
       </w:rPr>
       <mc:AlternateContent>
         <mc:Choice Requires="wps">
@@ -1730,7 +1831,7 @@
             </wp:anchor>
           </w:drawing>
         </mc:Choice>
-        <mc:Fallback>
+        <mc:Fallback xmlns:w16sdtfl="http://schemas.microsoft.com/office/word/2024/wordml/sdtformatlock" xmlns:w16sdtdh="http://schemas.microsoft.com/office/word/2020/wordml/sdtdatahash" xmlns:w16du="http://schemas.microsoft.com/office/word/2023/wordml/word16du" xmlns:w16="http://schemas.microsoft.com/office/word/2018/wordml" xmlns:w16cid="http://schemas.microsoft.com/office/word/2016/wordml/cid" xmlns:w16cex="http://schemas.microsoft.com/office/word/2018/wordml/cex" xmlns:oel="http://schemas.microsoft.com/office/2019/extlst" xmlns:am3d="http://schemas.microsoft.com/office/drawing/2017/model3d" xmlns:aink="http://schemas.microsoft.com/office/drawing/2016/ink" xmlns:cx8="http://schemas.microsoft.com/office/drawing/2016/5/14/chartex" xmlns:cx7="http://schemas.microsoft.com/office/drawing/2016/5/13/chartex" xmlns:cx6="http://schemas.microsoft.com/office/drawing/2016/5/12/chartex" xmlns:cx5="http://schemas.microsoft.com/office/drawing/2016/5/11/chartex" xmlns:cx4="http://schemas.microsoft.com/office/drawing/2016/5/10/chartex" xmlns:cx3="http://schemas.microsoft.com/office/drawing/2016/5/9/chartex" xmlns:cx2="http://schemas.microsoft.com/office/drawing/2015/10/21/chartex">
           <w:pict>
             <v:rect w14:anchorId="51FCCAB2" id="Rectángulo 464501756" o:spid="_x0000_s1028" style="position:absolute;margin-left:90.55pt;margin-top:-33.4pt;width:445.9pt;height:22.85pt;z-index:251663360;visibility:visible;mso-wrap-style:square;mso-wrap-distance-left:9pt;mso-wrap-distance-top:0;mso-wrap-distance-right:9pt;mso-wrap-distance-bottom:0;mso-position-horizontal:absolute;mso-position-horizontal-relative:text;mso-position-vertical:absolute;mso-position-vertical-relative:text;v-text-anchor:top" o:gfxdata="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" filled="f" stroked="f">
               <v:textbox inset="2.53958mm,1.2694mm,2.53958mm,1.2694mm">
@@ -1765,7 +1866,7 @@
 </file>
 
 <file path=word/footer3.xml><?xml version="1.0" encoding="utf-8"?>
-<w:ftr xmlns:wpc="http://schemas.microsoft.com/office/word/2010/wordprocessingCanvas" xmlns:cx="http://schemas.microsoft.com/office/drawing/2014/chartex" xmlns:cx1="http://schemas.microsoft.com/office/drawing/2015/9/8/chartex" xmlns:cx2="http://schemas.microsoft.com/office/drawing/2015/10/21/chartex" xmlns:cx3="http://schemas.microsoft.com/office/drawing/2016/5/9/chartex" xmlns:cx4="http://schemas.microsoft.com/office/drawing/2016/5/10/chartex" xmlns:cx5="http://schemas.microsoft.com/office/drawing/2016/5/11/chartex" xmlns:cx6="http://schemas.microsoft.com/office/drawing/2016/5/12/chartex" xmlns:cx7="http://schemas.microsoft.com/office/drawing/2016/5/13/chartex" xmlns:cx8="http://schemas.microsoft.com/office/drawing/2016/5/14/chartex" xmlns:mc="http://schemas.openxmlformats.org/markup-compatibility/2006" xmlns:aink="http://schemas.microsoft.com/office/drawing/2016/ink" xmlns:am3d="http://schemas.microsoft.com/office/drawing/2017/model3d" xmlns:o="urn:schemas-microsoft-com:office:office" xmlns:oel="http://schemas.microsoft.com/office/2019/extlst" xmlns:r="http://schemas.openxmlformats.org/officeDocument/2006/relationships" xmlns:m="http://schemas.openxmlformats.org/officeDocument/2006/math" xmlns:v="urn:schemas-microsoft-com:vml" xmlns:wp14="http://schemas.microsoft.com/office/word/2010/wordprocessingDrawing" xmlns:wp="http://schemas.openxmlformats.org/drawingml/2006/wordprocessingDrawing" xmlns:w10="urn:schemas-microsoft-com:office:word" xmlns:w="http://schemas.openxmlformats.org/wordprocessingml/2006/main" xmlns:w14="http://schemas.microsoft.com/office/word/2010/wordml" xmlns:w15="http://schemas.microsoft.com/office/word/2012/wordml" xmlns:w16cex="http://schemas.microsoft.com/office/word/2018/wordml/cex" xmlns:w16cid="http://schemas.microsoft.com/office/word/2016/wordml/cid" xmlns:w16="http://schemas.microsoft.com/office/word/2018/wordml" xmlns:w16du="http://schemas.microsoft.com/office/word/2023/wordml/word16du" xmlns:w16sdtdh="http://schemas.microsoft.com/office/word/2020/wordml/sdtdatahash" xmlns:w16sdtfl="http://schemas.microsoft.com/office/word/2024/wordml/sdtformatlock" xmlns:w16se="http://schemas.microsoft.com/office/word/2015/wordml/symex" xmlns:wpg="http://schemas.microsoft.com/office/word/2010/wordprocessingGroup" xmlns:wpi="http://schemas.microsoft.com/office/word/2010/wordprocessingInk" xmlns:wne="http://schemas.microsoft.com/office/word/2006/wordml" xmlns:wps="http://schemas.microsoft.com/office/word/2010/wordprocessingShape" mc:Ignorable="w14 w15 w16se w16cid w16 w16cex w16sdtdh w16sdtfl w16du wp14">
+<w:ftr xmlns:wpc="http://schemas.microsoft.com/office/word/2010/wordprocessingCanvas" xmlns:cx="http://schemas.microsoft.com/office/drawing/2014/chartex" xmlns:cx1="http://schemas.microsoft.com/office/drawing/2015/9/8/chartex" xmlns:mc="http://schemas.openxmlformats.org/markup-compatibility/2006" xmlns:o="urn:schemas-microsoft-com:office:office" xmlns:r="http://schemas.openxmlformats.org/officeDocument/2006/relationships" xmlns:m="http://schemas.openxmlformats.org/officeDocument/2006/math" xmlns:v="urn:schemas-microsoft-com:vml" xmlns:wp14="http://schemas.microsoft.com/office/word/2010/wordprocessingDrawing" xmlns:wp="http://schemas.openxmlformats.org/drawingml/2006/wordprocessingDrawing" xmlns:w10="urn:schemas-microsoft-com:office:word" xmlns:w="http://schemas.openxmlformats.org/wordprocessingml/2006/main" xmlns:w14="http://schemas.microsoft.com/office/word/2010/wordml" xmlns:w15="http://schemas.microsoft.com/office/word/2012/wordml" xmlns:w16se="http://schemas.microsoft.com/office/word/2015/wordml/symex" xmlns:wpg="http://schemas.microsoft.com/office/word/2010/wordprocessingGroup" xmlns:wpi="http://schemas.microsoft.com/office/word/2010/wordprocessingInk" xmlns:wne="http://schemas.microsoft.com/office/word/2006/wordml" xmlns:wps="http://schemas.microsoft.com/office/word/2010/wordprocessingShape" mc:Ignorable="w14 w15 w16se wp14">
   <w:p>
     <w:pPr>
       <w:pStyle w:val="Piedepgina"/>
@@ -1775,7 +1876,7 @@
 </file>
 
 <file path=word/footnotes.xml><?xml version="1.0" encoding="utf-8"?>
-<w:footnotes xmlns:wpc="http://schemas.microsoft.com/office/word/2010/wordprocessingCanvas" xmlns:cx="http://schemas.microsoft.com/office/drawing/2014/chartex" xmlns:cx1="http://schemas.microsoft.com/office/drawing/2015/9/8/chartex" xmlns:cx2="http://schemas.microsoft.com/office/drawing/2015/10/21/chartex" xmlns:cx3="http://schemas.microsoft.com/office/drawing/2016/5/9/chartex" xmlns:cx4="http://schemas.microsoft.com/office/drawing/2016/5/10/chartex" xmlns:cx5="http://schemas.microsoft.com/office/drawing/2016/5/11/chartex" xmlns:cx6="http://schemas.microsoft.com/office/drawing/2016/5/12/chartex" xmlns:cx7="http://schemas.microsoft.com/office/drawing/2016/5/13/chartex" xmlns:cx8="http://schemas.microsoft.com/office/drawing/2016/5/14/chartex" xmlns:mc="http://schemas.openxmlformats.org/markup-compatibility/2006" xmlns:aink="http://schemas.microsoft.com/office/drawing/2016/ink" xmlns:am3d="http://schemas.microsoft.com/office/drawing/2017/model3d" xmlns:o="urn:schemas-microsoft-com:office:office" xmlns:oel="http://schemas.microsoft.com/office/2019/extlst" xmlns:r="http://schemas.openxmlformats.org/officeDocument/2006/relationships" xmlns:m="http://schemas.openxmlformats.org/officeDocument/2006/math" xmlns:v="urn:schemas-microsoft-com:vml" xmlns:wp14="http://schemas.microsoft.com/office/word/2010/wordprocessingDrawing" xmlns:wp="http://schemas.openxmlformats.org/drawingml/2006/wordprocessingDrawing" xmlns:w10="urn:schemas-microsoft-com:office:word" xmlns:w="http://schemas.openxmlformats.org/wordprocessingml/2006/main" xmlns:w14="http://schemas.microsoft.com/office/word/2010/wordml" xmlns:w15="http://schemas.microsoft.com/office/word/2012/wordml" xmlns:w16cex="http://schemas.microsoft.com/office/word/2018/wordml/cex" xmlns:w16cid="http://schemas.microsoft.com/office/word/2016/wordml/cid" xmlns:w16="http://schemas.microsoft.com/office/word/2018/wordml" xmlns:w16du="http://schemas.microsoft.com/office/word/2023/wordml/word16du" xmlns:w16sdtdh="http://schemas.microsoft.com/office/word/2020/wordml/sdtdatahash" xmlns:w16sdtfl="http://schemas.microsoft.com/office/word/2024/wordml/sdtformatlock" xmlns:w16se="http://schemas.microsoft.com/office/word/2015/wordml/symex" xmlns:wpg="http://schemas.microsoft.com/office/word/2010/wordprocessingGroup" xmlns:wpi="http://schemas.microsoft.com/office/word/2010/wordprocessingInk" xmlns:wne="http://schemas.microsoft.com/office/word/2006/wordml" xmlns:wps="http://schemas.microsoft.com/office/word/2010/wordprocessingShape" mc:Ignorable="w14 w15 w16se w16cid w16 w16cex w16sdtdh w16sdtfl w16du wp14">
+<w:footnotes xmlns:wpc="http://schemas.microsoft.com/office/word/2010/wordprocessingCanvas" xmlns:cx="http://schemas.microsoft.com/office/drawing/2014/chartex" xmlns:cx1="http://schemas.microsoft.com/office/drawing/2015/9/8/chartex" xmlns:mc="http://schemas.openxmlformats.org/markup-compatibility/2006" xmlns:o="urn:schemas-microsoft-com:office:office" xmlns:r="http://schemas.openxmlformats.org/officeDocument/2006/relationships" xmlns:m="http://schemas.openxmlformats.org/officeDocument/2006/math" xmlns:v="urn:schemas-microsoft-com:vml" xmlns:wp14="http://schemas.microsoft.com/office/word/2010/wordprocessingDrawing" xmlns:wp="http://schemas.openxmlformats.org/drawingml/2006/wordprocessingDrawing" xmlns:w10="urn:schemas-microsoft-com:office:word" xmlns:w="http://schemas.openxmlformats.org/wordprocessingml/2006/main" xmlns:w14="http://schemas.microsoft.com/office/word/2010/wordml" xmlns:w15="http://schemas.microsoft.com/office/word/2012/wordml" xmlns:w16se="http://schemas.microsoft.com/office/word/2015/wordml/symex" xmlns:wpg="http://schemas.microsoft.com/office/word/2010/wordprocessingGroup" xmlns:wpi="http://schemas.microsoft.com/office/word/2010/wordprocessingInk" xmlns:wne="http://schemas.microsoft.com/office/word/2006/wordml" xmlns:wps="http://schemas.microsoft.com/office/word/2010/wordprocessingShape" mc:Ignorable="w14 w15 w16se wp14">
   <w:footnote w:type="separator" w:id="-1">
     <w:p>
       <w:pPr>
@@ -1800,7 +1901,7 @@
 </file>
 
 <file path=word/header1.xml><?xml version="1.0" encoding="utf-8"?>
-<w:hdr xmlns:wpc="http://schemas.microsoft.com/office/word/2010/wordprocessingCanvas" xmlns:cx="http://schemas.microsoft.com/office/drawing/2014/chartex" xmlns:cx1="http://schemas.microsoft.com/office/drawing/2015/9/8/chartex" xmlns:cx2="http://schemas.microsoft.com/office/drawing/2015/10/21/chartex" xmlns:cx3="http://schemas.microsoft.com/office/drawing/2016/5/9/chartex" xmlns:cx4="http://schemas.microsoft.com/office/drawing/2016/5/10/chartex" xmlns:cx5="http://schemas.microsoft.com/office/drawing/2016/5/11/chartex" xmlns:cx6="http://schemas.microsoft.com/office/drawing/2016/5/12/chartex" xmlns:cx7="http://schemas.microsoft.com/office/drawing/2016/5/13/chartex" xmlns:cx8="http://schemas.microsoft.com/office/drawing/2016/5/14/chartex" xmlns:mc="http://schemas.openxmlformats.org/markup-compatibility/2006" xmlns:aink="http://schemas.microsoft.com/office/drawing/2016/ink" xmlns:am3d="http://schemas.microsoft.com/office/drawing/2017/model3d" xmlns:o="urn:schemas-microsoft-com:office:office" xmlns:oel="http://schemas.microsoft.com/office/2019/extlst" xmlns:r="http://schemas.openxmlformats.org/officeDocument/2006/relationships" xmlns:m="http://schemas.openxmlformats.org/officeDocument/2006/math" xmlns:v="urn:schemas-microsoft-com:vml" xmlns:wp14="http://schemas.microsoft.com/office/word/2010/wordprocessingDrawing" xmlns:wp="http://schemas.openxmlformats.org/drawingml/2006/wordprocessingDrawing" xmlns:w10="urn:schemas-microsoft-com:office:word" xmlns:w="http://schemas.openxmlformats.org/wordprocessingml/2006/main" xmlns:w14="http://schemas.microsoft.com/office/word/2010/wordml" xmlns:w15="http://schemas.microsoft.com/office/word/2012/wordml" xmlns:w16cex="http://schemas.microsoft.com/office/word/2018/wordml/cex" xmlns:w16cid="http://schemas.microsoft.com/office/word/2016/wordml/cid" xmlns:w16="http://schemas.microsoft.com/office/word/2018/wordml" xmlns:w16du="http://schemas.microsoft.com/office/word/2023/wordml/word16du" xmlns:w16sdtdh="http://schemas.microsoft.com/office/word/2020/wordml/sdtdatahash" xmlns:w16sdtfl="http://schemas.microsoft.com/office/word/2024/wordml/sdtformatlock" xmlns:w16se="http://schemas.microsoft.com/office/word/2015/wordml/symex" xmlns:wpg="http://schemas.microsoft.com/office/word/2010/wordprocessingGroup" xmlns:wpi="http://schemas.microsoft.com/office/word/2010/wordprocessingInk" xmlns:wne="http://schemas.microsoft.com/office/word/2006/wordml" xmlns:wps="http://schemas.microsoft.com/office/word/2010/wordprocessingShape" mc:Ignorable="w14 w15 w16se w16cid w16 w16cex w16sdtdh w16sdtfl w16du wp14">
+<w:hdr xmlns:wpc="http://schemas.microsoft.com/office/word/2010/wordprocessingCanvas" xmlns:cx="http://schemas.microsoft.com/office/drawing/2014/chartex" xmlns:cx1="http://schemas.microsoft.com/office/drawing/2015/9/8/chartex" xmlns:mc="http://schemas.openxmlformats.org/markup-compatibility/2006" xmlns:o="urn:schemas-microsoft-com:office:office" xmlns:r="http://schemas.openxmlformats.org/officeDocument/2006/relationships" xmlns:m="http://schemas.openxmlformats.org/officeDocument/2006/math" xmlns:v="urn:schemas-microsoft-com:vml" xmlns:wp14="http://schemas.microsoft.com/office/word/2010/wordprocessingDrawing" xmlns:wp="http://schemas.openxmlformats.org/drawingml/2006/wordprocessingDrawing" xmlns:w10="urn:schemas-microsoft-com:office:word" xmlns:w="http://schemas.openxmlformats.org/wordprocessingml/2006/main" xmlns:w14="http://schemas.microsoft.com/office/word/2010/wordml" xmlns:w15="http://schemas.microsoft.com/office/word/2012/wordml" xmlns:w16se="http://schemas.microsoft.com/office/word/2015/wordml/symex" xmlns:wpg="http://schemas.microsoft.com/office/word/2010/wordprocessingGroup" xmlns:wpi="http://schemas.microsoft.com/office/word/2010/wordprocessingInk" xmlns:wne="http://schemas.microsoft.com/office/word/2006/wordml" xmlns:wps="http://schemas.microsoft.com/office/word/2010/wordprocessingShape" mc:Ignorable="w14 w15 w16se wp14">
   <w:p>
     <w:pPr>
       <w:pStyle w:val="Encabezado"/>
@@ -1810,7 +1911,7 @@
 </file>
 
 <file path=word/header2.xml><?xml version="1.0" encoding="utf-8"?>
-<w:hdr xmlns:wpc="http://schemas.microsoft.com/office/word/2010/wordprocessingCanvas" xmlns:cx="http://schemas.microsoft.com/office/drawing/2014/chartex" xmlns:cx1="http://schemas.microsoft.com/office/drawing/2015/9/8/chartex" xmlns:cx2="http://schemas.microsoft.com/office/drawing/2015/10/21/chartex" xmlns:cx3="http://schemas.microsoft.com/office/drawing/2016/5/9/chartex" xmlns:cx4="http://schemas.microsoft.com/office/drawing/2016/5/10/chartex" xmlns:cx5="http://schemas.microsoft.com/office/drawing/2016/5/11/chartex" xmlns:cx6="http://schemas.microsoft.com/office/drawing/2016/5/12/chartex" xmlns:cx7="http://schemas.microsoft.com/office/drawing/2016/5/13/chartex" xmlns:cx8="http://schemas.microsoft.com/office/drawing/2016/5/14/chartex" xmlns:mc="http://schemas.openxmlformats.org/markup-compatibility/2006" xmlns:aink="http://schemas.microsoft.com/office/drawing/2016/ink" xmlns:am3d="http://schemas.microsoft.com/office/drawing/2017/model3d" xmlns:o="urn:schemas-microsoft-com:office:office" xmlns:oel="http://schemas.microsoft.com/office/2019/extlst" xmlns:r="http://schemas.openxmlformats.org/officeDocument/2006/relationships" xmlns:m="http://schemas.openxmlformats.org/officeDocument/2006/math" xmlns:v="urn:schemas-microsoft-com:vml" xmlns:wp14="http://schemas.microsoft.com/office/word/2010/wordprocessingDrawing" xmlns:wp="http://schemas.openxmlformats.org/drawingml/2006/wordprocessingDrawing" xmlns:w10="urn:schemas-microsoft-com:office:word" xmlns:w="http://schemas.openxmlformats.org/wordprocessingml/2006/main" xmlns:w14="http://schemas.microsoft.com/office/word/2010/wordml" xmlns:w15="http://schemas.microsoft.com/office/word/2012/wordml" xmlns:w16cex="http://schemas.microsoft.com/office/word/2018/wordml/cex" xmlns:w16cid="http://schemas.microsoft.com/office/word/2016/wordml/cid" xmlns:w16="http://schemas.microsoft.com/office/word/2018/wordml" xmlns:w16du="http://schemas.microsoft.com/office/word/2023/wordml/word16du" xmlns:w16sdtdh="http://schemas.microsoft.com/office/word/2020/wordml/sdtdatahash" xmlns:w16sdtfl="http://schemas.microsoft.com/office/word/2024/wordml/sdtformatlock" xmlns:w16se="http://schemas.microsoft.com/office/word/2015/wordml/symex" xmlns:wpg="http://schemas.microsoft.com/office/word/2010/wordprocessingGroup" xmlns:wpi="http://schemas.microsoft.com/office/word/2010/wordprocessingInk" xmlns:wne="http://schemas.microsoft.com/office/word/2006/wordml" xmlns:wps="http://schemas.microsoft.com/office/word/2010/wordprocessingShape" mc:Ignorable="w14 w15 w16se w16cid w16 w16cex w16sdtdh w16sdtfl w16du wp14">
+<w:hdr xmlns:wpc="http://schemas.microsoft.com/office/word/2010/wordprocessingCanvas" xmlns:cx="http://schemas.microsoft.com/office/drawing/2014/chartex" xmlns:cx1="http://schemas.microsoft.com/office/drawing/2015/9/8/chartex" xmlns:mc="http://schemas.openxmlformats.org/markup-compatibility/2006" xmlns:o="urn:schemas-microsoft-com:office:office" xmlns:r="http://schemas.openxmlformats.org/officeDocument/2006/relationships" xmlns:m="http://schemas.openxmlformats.org/officeDocument/2006/math" xmlns:v="urn:schemas-microsoft-com:vml" xmlns:wp14="http://schemas.microsoft.com/office/word/2010/wordprocessingDrawing" xmlns:wp="http://schemas.openxmlformats.org/drawingml/2006/wordprocessingDrawing" xmlns:w10="urn:schemas-microsoft-com:office:word" xmlns:w="http://schemas.openxmlformats.org/wordprocessingml/2006/main" xmlns:w14="http://schemas.microsoft.com/office/word/2010/wordml" xmlns:w15="http://schemas.microsoft.com/office/word/2012/wordml" xmlns:w16se="http://schemas.microsoft.com/office/word/2015/wordml/symex" xmlns:wpg="http://schemas.microsoft.com/office/word/2010/wordprocessingGroup" xmlns:wpi="http://schemas.microsoft.com/office/word/2010/wordprocessingInk" xmlns:wne="http://schemas.microsoft.com/office/word/2006/wordml" xmlns:wps="http://schemas.microsoft.com/office/word/2010/wordprocessingShape" mc:Ignorable="w14 w15 w16se wp14">
   <w:p>
     <w:pPr>
       <w:pStyle w:val="Encabezado"/>
@@ -1818,6 +1919,7 @@
     <w:r>
       <w:rPr>
         <w:noProof/>
+        <w:lang w:eastAsia="es-MX"/>
       </w:rPr>
       <w:drawing>
         <wp:anchor distT="0" distB="0" distL="114300" distR="114300" simplePos="0" relativeHeight="251661312" behindDoc="1" locked="0" layoutInCell="1" allowOverlap="1" wp14:anchorId="2FE06CC2" wp14:editId="3526D751">
@@ -1874,7 +1976,7 @@
 </file>
 
 <file path=word/header3.xml><?xml version="1.0" encoding="utf-8"?>
-<w:hdr xmlns:wpc="http://schemas.microsoft.com/office/word/2010/wordprocessingCanvas" xmlns:cx="http://schemas.microsoft.com/office/drawing/2014/chartex" xmlns:cx1="http://schemas.microsoft.com/office/drawing/2015/9/8/chartex" xmlns:cx2="http://schemas.microsoft.com/office/drawing/2015/10/21/chartex" xmlns:cx3="http://schemas.microsoft.com/office/drawing/2016/5/9/chartex" xmlns:cx4="http://schemas.microsoft.com/office/drawing/2016/5/10/chartex" xmlns:cx5="http://schemas.microsoft.com/office/drawing/2016/5/11/chartex" xmlns:cx6="http://schemas.microsoft.com/office/drawing/2016/5/12/chartex" xmlns:cx7="http://schemas.microsoft.com/office/drawing/2016/5/13/chartex" xmlns:cx8="http://schemas.microsoft.com/office/drawing/2016/5/14/chartex" xmlns:mc="http://schemas.openxmlformats.org/markup-compatibility/2006" xmlns:aink="http://schemas.microsoft.com/office/drawing/2016/ink" xmlns:am3d="http://schemas.microsoft.com/office/drawing/2017/model3d" xmlns:o="urn:schemas-microsoft-com:office:office" xmlns:oel="http://schemas.microsoft.com/office/2019/extlst" xmlns:r="http://schemas.openxmlformats.org/officeDocument/2006/relationships" xmlns:m="http://schemas.openxmlformats.org/officeDocument/2006/math" xmlns:v="urn:schemas-microsoft-com:vml" xmlns:wp14="http://schemas.microsoft.com/office/word/2010/wordprocessingDrawing" xmlns:wp="http://schemas.openxmlformats.org/drawingml/2006/wordprocessingDrawing" xmlns:w10="urn:schemas-microsoft-com:office:word" xmlns:w="http://schemas.openxmlformats.org/wordprocessingml/2006/main" xmlns:w14="http://schemas.microsoft.com/office/word/2010/wordml" xmlns:w15="http://schemas.microsoft.com/office/word/2012/wordml" xmlns:w16cex="http://schemas.microsoft.com/office/word/2018/wordml/cex" xmlns:w16cid="http://schemas.microsoft.com/office/word/2016/wordml/cid" xmlns:w16="http://schemas.microsoft.com/office/word/2018/wordml" xmlns:w16du="http://schemas.microsoft.com/office/word/2023/wordml/word16du" xmlns:w16sdtdh="http://schemas.microsoft.com/office/word/2020/wordml/sdtdatahash" xmlns:w16sdtfl="http://schemas.microsoft.com/office/word/2024/wordml/sdtformatlock" xmlns:w16se="http://schemas.microsoft.com/office/word/2015/wordml/symex" xmlns:wpg="http://schemas.microsoft.com/office/word/2010/wordprocessingGroup" xmlns:wpi="http://schemas.microsoft.com/office/word/2010/wordprocessingInk" xmlns:wne="http://schemas.microsoft.com/office/word/2006/wordml" xmlns:wps="http://schemas.microsoft.com/office/word/2010/wordprocessingShape" mc:Ignorable="w14 w15 w16se w16cid w16 w16cex w16sdtdh w16sdtfl w16du wp14">
+<w:hdr xmlns:wpc="http://schemas.microsoft.com/office/word/2010/wordprocessingCanvas" xmlns:cx="http://schemas.microsoft.com/office/drawing/2014/chartex" xmlns:cx1="http://schemas.microsoft.com/office/drawing/2015/9/8/chartex" xmlns:mc="http://schemas.openxmlformats.org/markup-compatibility/2006" xmlns:o="urn:schemas-microsoft-com:office:office" xmlns:r="http://schemas.openxmlformats.org/officeDocument/2006/relationships" xmlns:m="http://schemas.openxmlformats.org/officeDocument/2006/math" xmlns:v="urn:schemas-microsoft-com:vml" xmlns:wp14="http://schemas.microsoft.com/office/word/2010/wordprocessingDrawing" xmlns:wp="http://schemas.openxmlformats.org/drawingml/2006/wordprocessingDrawing" xmlns:w10="urn:schemas-microsoft-com:office:word" xmlns:w="http://schemas.openxmlformats.org/wordprocessingml/2006/main" xmlns:w14="http://schemas.microsoft.com/office/word/2010/wordml" xmlns:w15="http://schemas.microsoft.com/office/word/2012/wordml" xmlns:w16se="http://schemas.microsoft.com/office/word/2015/wordml/symex" xmlns:wpg="http://schemas.microsoft.com/office/word/2010/wordprocessingGroup" xmlns:wpi="http://schemas.microsoft.com/office/word/2010/wordprocessingInk" xmlns:wne="http://schemas.microsoft.com/office/word/2006/wordml" xmlns:wps="http://schemas.microsoft.com/office/word/2010/wordprocessingShape" mc:Ignorable="w14 w15 w16se wp14">
   <w:p>
     <w:pPr>
       <w:pStyle w:val="Encabezado"/>
@@ -1884,7 +1986,7 @@
 </file>
 
 <file path=word/styles.xml><?xml version="1.0" encoding="utf-8"?>
-<w:styles xmlns:mc="http://schemas.openxmlformats.org/markup-compatibility/2006" xmlns:r="http://schemas.openxmlformats.org/officeDocument/2006/relationships" xmlns:w="http://schemas.openxmlformats.org/wordprocessingml/2006/main" xmlns:w14="http://schemas.microsoft.com/office/word/2010/wordml" xmlns:w15="http://schemas.microsoft.com/office/word/2012/wordml" xmlns:w16cex="http://schemas.microsoft.com/office/word/2018/wordml/cex" xmlns:w16cid="http://schemas.microsoft.com/office/word/2016/wordml/cid" xmlns:w16="http://schemas.microsoft.com/office/word/2018/wordml" xmlns:w16du="http://schemas.microsoft.com/office/word/2023/wordml/word16du" xmlns:w16sdtdh="http://schemas.microsoft.com/office/word/2020/wordml/sdtdatahash" xmlns:w16sdtfl="http://schemas.microsoft.com/office/word/2024/wordml/sdtformatlock" xmlns:w16se="http://schemas.microsoft.com/office/word/2015/wordml/symex" mc:Ignorable="w14 w15 w16se w16cid w16 w16cex w16sdtdh w16sdtfl w16du">
+<w:styles xmlns:mc="http://schemas.openxmlformats.org/markup-compatibility/2006" xmlns:r="http://schemas.openxmlformats.org/officeDocument/2006/relationships" xmlns:w="http://schemas.openxmlformats.org/wordprocessingml/2006/main" xmlns:w14="http://schemas.microsoft.com/office/word/2010/wordml" xmlns:w15="http://schemas.microsoft.com/office/word/2012/wordml" xmlns:w16se="http://schemas.microsoft.com/office/word/2015/wordml/symex" mc:Ignorable="w14 w15 w16se">
   <w:docDefaults>
     <w:rPrDefault>
       <w:rPr>
@@ -1902,7 +2004,7 @@
       </w:pPr>
     </w:pPrDefault>
   </w:docDefaults>
-  <w:latentStyles w:defLockedState="0" w:defUIPriority="99" w:defSemiHidden="0" w:defUnhideWhenUsed="0" w:defQFormat="0" w:count="376">
+  <w:latentStyles w:defLockedState="0" w:defUIPriority="99" w:defSemiHidden="0" w:defUnhideWhenUsed="0" w:defQFormat="0" w:count="371">
     <w:lsdException w:name="Normal" w:uiPriority="0" w:qFormat="1"/>
     <w:lsdException w:name="heading 1" w:uiPriority="9" w:qFormat="1"/>
     <w:lsdException w:name="heading 2" w:semiHidden="1" w:uiPriority="9" w:unhideWhenUsed="1" w:qFormat="1"/>
@@ -2274,11 +2376,6 @@
     <w:lsdException w:name="List Table 5 Dark Accent 6" w:uiPriority="50"/>
     <w:lsdException w:name="List Table 6 Colorful Accent 6" w:uiPriority="51"/>
     <w:lsdException w:name="List Table 7 Colorful Accent 6" w:uiPriority="52"/>
-    <w:lsdException w:name="Mention" w:semiHidden="1" w:unhideWhenUsed="1"/>
-    <w:lsdException w:name="Smart Hyperlink" w:semiHidden="1" w:unhideWhenUsed="1"/>
-    <w:lsdException w:name="Hashtag" w:semiHidden="1" w:unhideWhenUsed="1"/>
-    <w:lsdException w:name="Unresolved Mention" w:semiHidden="1" w:unhideWhenUsed="1"/>
-    <w:lsdException w:name="Smart Link" w:semiHidden="1" w:unhideWhenUsed="1"/>
   </w:latentStyles>
   <w:style w:type="paragraph" w:default="1" w:styleId="Normal">
     <w:name w:val="Normal"/>
@@ -3166,7 +3263,7 @@
 </file>
 
 <file path=customXml/itemProps1.xml><?xml version="1.0" encoding="utf-8"?>
-<ds:datastoreItem xmlns:ds="http://schemas.openxmlformats.org/officeDocument/2006/customXml" ds:itemID="{682B6E8E-9A22-4203-98DB-2D9C7DB8D05F}">
+<ds:datastoreItem xmlns:ds="http://schemas.openxmlformats.org/officeDocument/2006/customXml" ds:itemID="{1FECC8FD-8515-4050-BD66-1C102951157B}">
   <ds:schemaRefs>
     <ds:schemaRef ds:uri="http://schemas.openxmlformats.org/officeDocument/2006/bibliography"/>
   </ds:schemaRefs>

</xml_diff>